<commit_message>
Publish תשפ"ז סמסטר א: new syllabus, updated lectures 1-8, exam FAQ
Hosted MCP setup (Claude and ChatGPT) in the README, library and parking worked
examples in materials, and the summer semester's transcripts retired.

Co-Authored-By: Claude Opus 5.5 <noreply@anthropic.com>
</commit_message>
<xml_diff>
--- a/materials/3-ניתוח-דרישות/תוצר-מאומת/סיפורי-משתמש-קמפוס.docx
+++ b/materials/3-ניתוח-דרישות/תוצר-מאומת/סיפורי-משתמש-קמפוס.docx
@@ -2,7 +2,7 @@
 <file path=word/document.xml><?xml version="1.0" encoding="utf-8"?>
 <w:document xmlns:w="http://schemas.openxmlformats.org/wordprocessingml/2006/main" xmlns:m="http://schemas.openxmlformats.org/officeDocument/2006/math" xmlns:r="http://schemas.openxmlformats.org/officeDocument/2006/relationships" xmlns:o="urn:schemas-microsoft-com:office:office" xmlns:v="urn:schemas-microsoft-com:vml" xmlns:w10="urn:schemas-microsoft-com:office:word" xmlns:a="http://schemas.openxmlformats.org/drawingml/2006/main" xmlns:pic="http://schemas.openxmlformats.org/drawingml/2006/picture" xmlns:wp="http://schemas.openxmlformats.org/drawingml/2006/wordprocessingDrawing">
   <w:body>
-    <w:bookmarkStart w:id="36" w:name="סיפורי-משתמש--מערכת-הזמנת-האוכל-בקמפוס"/>
+    <w:bookmarkStart w:id="39" w:name="סיפורי-משתמש--מערכת-הזמנת-האוכל-בקמפוס"/>
     <w:p>
       <w:pPr>
         <w:pStyle w:val="Heading1"/>
@@ -378,7 +378,7 @@
         <w:t xml:space="preserve">הרלוונטי · הסיפור עצמו נשאר קצר — הפירוט חי בתנאים, לא במשפט.</w:t>
       </w:r>
     </w:p>
-    <w:bookmarkStart w:id="10" w:name="שני-כללים-שקובעים-כמה-סיפורים-ייצאו-לכם"/>
+    <w:bookmarkStart w:id="10" w:name="X644e7ad73400e53eed610f1f20c6d5b0dfdd0b4"/>
     <w:p>
       <w:pPr>
         <w:pStyle w:val="Heading3"/>
@@ -388,7 +388,7 @@
         <w:rPr>
           <w:rtl/>
         </w:rPr>
-        <w:t xml:space="preserve">שני כללים שקובעים כמה סיפורים ייצאו לכם</w:t>
+        <w:t xml:space="preserve">שלושה כללים שקובעים כמה סיפורים ייצאו לכם</w:t>
       </w:r>
     </w:p>
     <w:p>
@@ -398,61 +398,215 @@
       </w:pPr>
       <w:r>
         <w:rPr>
-          <w:b/>
-          <w:bCs/>
-          <w:rtl/>
-        </w:rPr>
-        <w:t xml:space="preserve">1. דרישת CRUD מתפרקת לארבעה סיפורים — אחד לכל פעולה.</w:t>
-      </w:r>
-      <w:r>
-        <w:rPr>
-          <w:rtl/>
-        </w:rPr>
-        <w:t xml:space="preserve"> </w:t>
-      </w:r>
-      <w:r>
-        <w:rPr>
-          <w:rtl/>
-        </w:rPr>
-        <w:t xml:space="preserve">״לנהל את העובדים״ הוא</w:t>
-      </w:r>
-      <w:r>
-        <w:rPr>
-          <w:rtl/>
-        </w:rPr>
-        <w:t xml:space="preserve"> </w:t>
-      </w:r>
-      <w:r>
-        <w:rPr>
-          <w:b/>
-          <w:bCs/>
-          <w:rtl/>
-        </w:rPr>
-        <w:t xml:space="preserve">אפוס</w:t>
-      </w:r>
-      <w:r>
-        <w:rPr>
-          <w:rtl/>
-        </w:rPr>
-        <w:t xml:space="preserve"> </w:t>
-      </w:r>
-      <w:r>
-        <w:rPr>
-          <w:rtl/>
-        </w:rPr>
-        <w:t xml:space="preserve">(Epic), לא סיפור: הוא גדול מכדי לתכנן, לאמוד או לבדוק אותו כיחידה אחת. לכן</w:t>
-      </w:r>
-      <w:r>
-        <w:rPr>
-          <w:rtl/>
-        </w:rPr>
-        <w:t xml:space="preserve"> </w:t>
-      </w:r>
-      <w:r>
-        <w:rPr>
-          <w:rtl/>
-        </w:rPr>
-        <w:t xml:space="preserve">כותבים ארבעה סיפורים נפרדים — יצירה, קריאה, עדכון, מחיקה — כל אחד עם תנאי הקבלה שלו</w:t>
+          <w:rtl/>
+        </w:rPr>
+        <w:t xml:space="preserve">אין מספר יעד של סיפורים. כל דרישה, פונקציונלית ולא-פונקציונלית, מכוסה בסיפור, למעט דרישה</w:t>
+      </w:r>
+      <w:r>
+        <w:rPr>
+          <w:rtl/>
+        </w:rPr>
+        <w:t xml:space="preserve"> </w:t>
+      </w:r>
+      <w:r>
+        <w:rPr>
+          <w:rtl/>
+        </w:rPr>
+        <w:t xml:space="preserve">שסומנה</w:t>
+      </w:r>
+      <w:r>
+        <w:rPr>
+          <w:rtl/>
+        </w:rPr>
+        <w:t xml:space="preserve"> </w:t>
+      </w:r>
+      <w:r>
+        <w:rPr>
+          <w:rStyle w:val="VerbatimChar"/>
+          <w:rtl/>
+        </w:rPr>
+        <w:t xml:space="preserve">Won't</w:t>
+      </w:r>
+      <w:r>
+        <w:rPr>
+          <w:rtl/>
+        </w:rPr>
+        <w:t xml:space="preserve">. סיפור אחד יכול לכסות כמה דרישות (</w:t>
+      </w:r>
+      <w:r>
+        <w:rPr>
+          <w:rStyle w:val="VerbatimChar"/>
+          <w:rtl/>
+        </w:rPr>
+        <w:t xml:space="preserve">US-1</w:t>
+      </w:r>
+      <w:r>
+        <w:rPr>
+          <w:rtl/>
+        </w:rPr>
+        <w:t xml:space="preserve"> </w:t>
+      </w:r>
+      <w:r>
+        <w:rPr>
+          <w:rtl/>
+        </w:rPr>
+        <w:t xml:space="preserve">כאן מכסה שתיים). הכללים הבאים קובעים מתי יכולת היא סיפור</w:t>
+      </w:r>
+      <w:r>
+        <w:rPr>
+          <w:rtl/>
+        </w:rPr>
+        <w:t xml:space="preserve"> </w:t>
+      </w:r>
+      <w:r>
+        <w:rPr>
+          <w:rtl/>
+        </w:rPr>
+        <w:t xml:space="preserve">אחד ומתי היא כמה.</w:t>
+      </w:r>
+    </w:p>
+    <w:p>
+      <w:pPr>
+        <w:pStyle w:val="BodyText"/>
+        <w:bidi/>
+      </w:pPr>
+      <w:r>
+        <w:rPr>
+          <w:b/>
+          <w:bCs/>
+          <w:rtl/>
+        </w:rPr>
+        <w:t xml:space="preserve">1. יכולת אחת = סיפור אחד, גם כשיש לה כמה סיבות.</w:t>
+      </w:r>
+      <w:r>
+        <w:rPr>
+          <w:rtl/>
+        </w:rPr>
+        <w:t xml:space="preserve"> </w:t>
+      </w:r>
+      <w:r>
+        <w:rPr>
+          <w:rtl/>
+        </w:rPr>
+        <w:t xml:space="preserve">המבחן הוא</w:t>
+      </w:r>
+      <w:r>
+        <w:rPr>
+          <w:rtl/>
+        </w:rPr>
+        <w:t xml:space="preserve"> </w:t>
+      </w:r>
+      <w:r>
+        <w:rPr>
+          <w:b/>
+          <w:bCs/>
+          <w:rtl/>
+        </w:rPr>
+        <w:t xml:space="preserve">תנאי הקבלה</w:t>
+      </w:r>
+      <w:r>
+        <w:rPr>
+          <w:rtl/>
+        </w:rPr>
+        <w:t xml:space="preserve">: שני</w:t>
+      </w:r>
+      <w:r>
+        <w:rPr>
+          <w:rtl/>
+        </w:rPr>
+        <w:t xml:space="preserve"> </w:t>
+      </w:r>
+      <w:r>
+        <w:rPr>
+          <w:rtl/>
+        </w:rPr>
+        <w:t xml:space="preserve">סיפורים עם אותם תנאי קבלה הם סיפור אחד שנכתב פעמיים. בוחרים למשפט את הסיבה החזקה, ואת</w:t>
+      </w:r>
+      <w:r>
+        <w:rPr>
+          <w:rtl/>
+        </w:rPr>
+        <w:t xml:space="preserve"> </w:t>
+      </w:r>
+      <w:r>
+        <w:rPr>
+          <w:rtl/>
+        </w:rPr>
+        <w:t xml:space="preserve">השאר רושמים בהערת המקור שמתחת לסיפור. מפצלים רק כשסיבה אחרת מובילה להתנהגות אחרת, כלומר</w:t>
+      </w:r>
+      <w:r>
+        <w:rPr>
+          <w:rtl/>
+        </w:rPr>
+        <w:t xml:space="preserve"> </w:t>
+      </w:r>
+      <w:r>
+        <w:rPr>
+          <w:rtl/>
+        </w:rPr>
+        <w:t xml:space="preserve">לתנאי קבלה אחרים; אז היכולת עצמה שונה, ולרוב חסרה דרישה מפורטת. אותו מבחן חל כשכמה</w:t>
+      </w:r>
+      <w:r>
+        <w:rPr>
+          <w:rtl/>
+        </w:rPr>
+        <w:t xml:space="preserve"> </w:t>
+      </w:r>
+      <w:r>
+        <w:rPr>
+          <w:rtl/>
+        </w:rPr>
+        <w:t xml:space="preserve">תפקידים רוצים אותה יכולת: מפצלים רק כשתנאי הקבלה או ההרשאות שונים.</w:t>
+      </w:r>
+    </w:p>
+    <w:p>
+      <w:pPr>
+        <w:pStyle w:val="BodyText"/>
+        <w:bidi/>
+      </w:pPr>
+      <w:r>
+        <w:rPr>
+          <w:b/>
+          <w:bCs/>
+          <w:rtl/>
+        </w:rPr>
+        <w:t xml:space="preserve">2. דרישת CRUD מתפרקת לפחות לארבעה סיפורים, אחד לכל פעולה.</w:t>
+      </w:r>
+      <w:r>
+        <w:rPr>
+          <w:rtl/>
+        </w:rPr>
+        <w:t xml:space="preserve"> </w:t>
+      </w:r>
+      <w:r>
+        <w:rPr>
+          <w:rtl/>
+        </w:rPr>
+        <w:t xml:space="preserve">״לנהל את העובדים״ אינו</w:t>
+      </w:r>
+      <w:r>
+        <w:rPr>
+          <w:rtl/>
+        </w:rPr>
+        <w:t xml:space="preserve"> </w:t>
+      </w:r>
+      <w:r>
+        <w:rPr>
+          <w:rtl/>
+        </w:rPr>
+        <w:t xml:space="preserve">סיפור: הוא גדול מכדי לתכנן, לאמוד או לבדוק אותו כיחידה אחת. לכן</w:t>
+      </w:r>
+      <w:r>
+        <w:rPr>
+          <w:rtl/>
+        </w:rPr>
+        <w:t xml:space="preserve"> </w:t>
+      </w:r>
+      <w:r>
+        <w:rPr>
+          <w:rtl/>
+        </w:rPr>
+        <w:t xml:space="preserve">כותבים סיפור נפרד לכל פעולה (יצירה, קריאה, עדכון, מחיקה), כל אחד עם תנאי הקבלה שלו</w:t>
       </w:r>
       <w:r>
         <w:rPr>
@@ -496,37 +650,31 @@
         <w:rPr>
           <w:rtl/>
         </w:rPr>
-        <w:t xml:space="preserve">כאן).</w:t>
-      </w:r>
-      <w:r>
-        <w:rPr>
-          <w:rtl/>
-        </w:rPr>
-        <w:t xml:space="preserve"> </w:t>
-      </w:r>
-      <w:r>
-        <w:rPr>
-          <w:i/>
-          <w:iCs/>
-          <w:rtl/>
-        </w:rPr>
-        <w:t xml:space="preserve">הערה למי שמכיר Agile: בהמשך הקורס נראה שאפשר להחזיק את הארבעה</w:t>
-      </w:r>
-      <w:r>
-        <w:rPr>
-          <w:i/>
-          <w:iCs/>
-          <w:rtl/>
-        </w:rPr>
-        <w:t xml:space="preserve"> </w:t>
-      </w:r>
-      <w:r>
-        <w:rPr>
-          <w:i/>
-          <w:iCs/>
-          <w:rtl/>
-        </w:rPr>
-        <w:t xml:space="preserve">תחת אפוס אחד ולפרק אותם ממנו; בשלב זה כותבים אותם ישירות כארבעה סיפורים.</w:t>
+        <w:t xml:space="preserve">כאן). פעולה המשרתת מקרים שונים מתפרקת עוד, לפי המבחן של כלל 1: צפייה</w:t>
+      </w:r>
+      <w:r>
+        <w:rPr>
+          <w:rtl/>
+        </w:rPr>
+        <w:t xml:space="preserve"> </w:t>
+      </w:r>
+      <w:r>
+        <w:rPr>
+          <w:rtl/>
+        </w:rPr>
+        <w:t xml:space="preserve">ברשימת העובדים הפעילים ואיתור עובד בודד לפי מספר הם שני סיפורים, כי תנאי הקבלה שלהם</w:t>
+      </w:r>
+      <w:r>
+        <w:rPr>
+          <w:rtl/>
+        </w:rPr>
+        <w:t xml:space="preserve"> </w:t>
+      </w:r>
+      <w:r>
+        <w:rPr>
+          <w:rtl/>
+        </w:rPr>
+        <w:t xml:space="preserve">שונים; חיפוש לפי שם או לפי טלפון באותו מסך הוא סיפור אחד.</w:t>
       </w:r>
     </w:p>
     <w:p>
@@ -540,7 +688,7 @@
           <w:bCs/>
           <w:rtl/>
         </w:rPr>
-        <w:t xml:space="preserve">2. המספור של הסיפורים עצמאי — הוא אינו עוקב אחרי מספרי הדרישות.</w:t>
+        <w:t xml:space="preserve">3. המספור של הסיפורים עצמאי: הוא אינו עוקב אחרי מספרי הדרישות.</w:t>
       </w:r>
       <w:r>
         <w:rPr>
@@ -2943,45 +3091,19 @@
         <w:rPr>
           <w:rtl/>
         </w:rPr>
-        <w:t xml:space="preserve">ארבע פעולות, ארבעה סיפורים. ״כמנהל אני רוצה לנהל את העובדים״ הוא</w:t>
-      </w:r>
-      <w:r>
-        <w:rPr>
-          <w:rtl/>
-        </w:rPr>
-        <w:t xml:space="preserve"> </w:t>
-      </w:r>
-      <w:r>
-        <w:rPr>
-          <w:b/>
-          <w:bCs/>
-          <w:rtl/>
-        </w:rPr>
-        <w:t xml:space="preserve">אפוס</w:t>
-      </w:r>
-      <w:r>
-        <w:rPr>
-          <w:rtl/>
-        </w:rPr>
-        <w:t xml:space="preserve"> </w:t>
-      </w:r>
-      <w:r>
-        <w:rPr>
-          <w:rtl/>
-        </w:rPr>
-        <w:t xml:space="preserve">— הוא נשמע</w:t>
-      </w:r>
-      <w:r>
-        <w:rPr>
-          <w:rtl/>
-        </w:rPr>
-        <w:t xml:space="preserve"> </w:t>
-      </w:r>
-      <w:r>
-        <w:rPr>
-          <w:rtl/>
-        </w:rPr>
-        <w:t xml:space="preserve">כמו סיפור אבל אי-אפשר לאמוד או לבדוק אותו. הפירוק הזה הוא בדיוק פירוק ה-CRUD של</w:t>
+        <w:t xml:space="preserve">ארבע פעולות, ולפחות ארבעה סיפורים. ״כמנהל אני רוצה לנהל את העובדים״ נשמע כמו סיפור,</w:t>
+      </w:r>
+      <w:r>
+        <w:rPr>
+          <w:rtl/>
+        </w:rPr>
+        <w:t xml:space="preserve"> </w:t>
+      </w:r>
+      <w:r>
+        <w:rPr>
+          <w:rtl/>
+        </w:rPr>
+        <w:t xml:space="preserve">אבל אי-אפשר לאמוד או לבדוק אותו. הפירוק הזה הוא בדיוק פירוק ה-CRUD של</w:t>
       </w:r>
       <w:r>
         <w:rPr>
@@ -4051,7 +4173,7 @@
     </w:p>
     <w:bookmarkEnd w:id="26"/>
     <w:bookmarkEnd w:id="27"/>
-    <w:bookmarkStart w:id="32" w:name="הסיפורים--דרישות-לא-פונקציונליות"/>
+    <w:bookmarkStart w:id="29" w:name="הסיפורים-דרישה-מוזנקת-זמן-fr-12"/>
     <w:p>
       <w:pPr>
         <w:pStyle w:val="Heading2"/>
@@ -4061,7 +4183,20 @@
         <w:rPr>
           <w:rtl/>
         </w:rPr>
-        <w:t xml:space="preserve">הסיפורים — דרישות לא-פונקציונליות</w:t>
+        <w:t xml:space="preserve">הסיפורים: דרישה מוזנקת-זמן (</w:t>
+      </w:r>
+      <w:r>
+        <w:rPr>
+          <w:rStyle w:val="VerbatimChar"/>
+          <w:rtl/>
+        </w:rPr>
+        <w:t xml:space="preserve">FR-12</w:t>
+      </w:r>
+      <w:r>
+        <w:rPr>
+          <w:rtl/>
+        </w:rPr>
+        <w:t xml:space="preserve">)</w:t>
       </w:r>
     </w:p>
     <w:p>
@@ -4073,77 +4208,7 @@
         <w:rPr>
           <w:rtl/>
         </w:rPr>
-        <w:t xml:space="preserve">גם דרישה לא-פונקציונלית אפשר לנסח כסיפור, כשיש מאחוריה</w:t>
-      </w:r>
-      <w:r>
-        <w:rPr>
-          <w:rtl/>
-        </w:rPr>
-        <w:t xml:space="preserve"> </w:t>
-      </w:r>
-      <w:r>
-        <w:rPr>
-          <w:b/>
-          <w:bCs/>
-          <w:rtl/>
-        </w:rPr>
-        <w:t xml:space="preserve">מישהו שרוצה משהו</w:t>
-      </w:r>
-      <w:r>
-        <w:rPr>
-          <w:rtl/>
-        </w:rPr>
-        <w:t xml:space="preserve">. התנאים</w:t>
-      </w:r>
-      <w:r>
-        <w:rPr>
-          <w:rtl/>
-        </w:rPr>
-        <w:t xml:space="preserve"> </w:t>
-      </w:r>
-      <w:r>
-        <w:rPr>
-          <w:rtl/>
-        </w:rPr>
-        <w:t xml:space="preserve">נושאים את</w:t>
-      </w:r>
-      <w:r>
-        <w:rPr>
-          <w:rtl/>
-        </w:rPr>
-        <w:t xml:space="preserve"> </w:t>
-      </w:r>
-      <w:r>
-        <w:rPr>
-          <w:b/>
-          <w:bCs/>
-          <w:rtl/>
-        </w:rPr>
-        <w:t xml:space="preserve">המדד</w:t>
-      </w:r>
-      <w:r>
-        <w:rPr>
-          <w:rtl/>
-        </w:rPr>
-        <w:t xml:space="preserve"> </w:t>
-      </w:r>
-      <w:r>
-        <w:rPr>
-          <w:rtl/>
-        </w:rPr>
-        <w:t xml:space="preserve">— בלי מדד זו משאלה, לא דרישה. וכשאין מאחוריה משתמש שרוצה — כותבים</w:t>
-      </w:r>
-      <w:r>
-        <w:rPr>
-          <w:rtl/>
-        </w:rPr>
-        <w:t xml:space="preserve"> </w:t>
-      </w:r>
-      <w:r>
-        <w:rPr>
-          <w:rtl/>
-        </w:rPr>
-        <w:t xml:space="preserve">אותה במלל, ולא מכריחים אותה לתוך התבנית (ראו</w:t>
+        <w:t xml:space="preserve">השחקן של</w:t>
       </w:r>
       <w:r>
         <w:rPr>
@@ -4156,22 +4221,94 @@
           <w:rStyle w:val="VerbatimChar"/>
           <w:rtl/>
         </w:rPr>
-        <w:t xml:space="preserve">NFR-4</w:t>
-      </w:r>
-      <w:r>
-        <w:rPr>
-          <w:rtl/>
-        </w:rPr>
-        <w:t xml:space="preserve"> </w:t>
-      </w:r>
-      <w:r>
-        <w:rPr>
-          <w:rtl/>
-        </w:rPr>
-        <w:t xml:space="preserve">בטבלה השנייה למטה).</w:t>
-      </w:r>
-    </w:p>
-    <w:bookmarkStart w:id="28" w:name="X4c8f2c02ef534c048f205a3e66cbb58e0c04327"/>
+        <w:t xml:space="preserve">FR-12</w:t>
+      </w:r>
+      <w:r>
+        <w:rPr>
+          <w:rtl/>
+        </w:rPr>
+        <w:t xml:space="preserve"> </w:t>
+      </w:r>
+      <w:r>
+        <w:rPr>
+          <w:rtl/>
+        </w:rPr>
+        <w:t xml:space="preserve">הוא</w:t>
+      </w:r>
+      <w:r>
+        <w:rPr>
+          <w:rtl/>
+        </w:rPr>
+        <w:t xml:space="preserve"> </w:t>
+      </w:r>
+      <w:r>
+        <w:rPr>
+          <w:b/>
+          <w:bCs/>
+          <w:rtl/>
+        </w:rPr>
+        <w:t xml:space="preserve">⏰ זמן</w:t>
+      </w:r>
+      <w:r>
+        <w:rPr>
+          <w:rtl/>
+        </w:rPr>
+        <w:t xml:space="preserve">: איש אינו לוחץ על כפתור. אבל מישהו רוצה את התוצאה, והוא</w:t>
+      </w:r>
+      <w:r>
+        <w:rPr>
+          <w:rtl/>
+        </w:rPr>
+        <w:t xml:space="preserve"> </w:t>
+      </w:r>
+      <w:r>
+        <w:rPr>
+          <w:rtl/>
+        </w:rPr>
+        <w:t xml:space="preserve">ה״כ...״ של הסיפור. השחקן בתרחיש הוא</w:t>
+      </w:r>
+      <w:r>
+        <w:rPr>
+          <w:rtl/>
+        </w:rPr>
+        <w:t xml:space="preserve"> </w:t>
+      </w:r>
+      <w:r>
+        <w:rPr>
+          <w:b/>
+          <w:bCs/>
+          <w:rtl/>
+        </w:rPr>
+        <w:t xml:space="preserve">מי שיוזם</w:t>
+      </w:r>
+      <w:r>
+        <w:rPr>
+          <w:rtl/>
+        </w:rPr>
+        <w:t xml:space="preserve">; הדמות בסיפור היא</w:t>
+      </w:r>
+      <w:r>
+        <w:rPr>
+          <w:rtl/>
+        </w:rPr>
+        <w:t xml:space="preserve"> </w:t>
+      </w:r>
+      <w:r>
+        <w:rPr>
+          <w:b/>
+          <w:bCs/>
+          <w:rtl/>
+        </w:rPr>
+        <w:t xml:space="preserve">מי שרוצה</w:t>
+      </w:r>
+      <w:r>
+        <w:rPr>
+          <w:rtl/>
+        </w:rPr>
+        <w:t xml:space="preserve">.</w:t>
+      </w:r>
+    </w:p>
+    <w:bookmarkStart w:id="28" w:name="X245df132a99e936b6b35849de4bb059f8a30ceb"/>
     <w:p>
       <w:pPr>
         <w:pStyle w:val="Heading3"/>
@@ -4181,7 +4318,7 @@
         <w:rPr>
           <w:rtl/>
         </w:rPr>
-        <w:t xml:space="preserve">US-13 · המערכת מגיבה גם בשיא הצהריים —</w:t>
+        <w:t xml:space="preserve">US-13 · הזמנות שלא נאספו מגיעות אליי —</w:t>
       </w:r>
       <w:r>
         <w:rPr>
@@ -4215,7 +4352,7 @@
           <w:bCs/>
           <w:rtl/>
         </w:rPr>
-        <w:t xml:space="preserve">סטודנט</w:t>
+        <w:t xml:space="preserve">מנהל הקפיטריה</w:t>
       </w:r>
       <w:r>
         <w:rPr>
@@ -4235,7 +4372,23 @@
           <w:bCs/>
           <w:rtl/>
         </w:rPr>
-        <w:t xml:space="preserve">שהמערכת תגיב מיד גם בעומס של 12:00</w:t>
+        <w:t xml:space="preserve">לדעת אילו הזמנות שולמו ולא נאספו כשחלון האיסוף שלהן</w:t>
+      </w:r>
+      <w:r>
+        <w:rPr>
+          <w:b/>
+          <w:bCs/>
+          <w:rtl/>
+        </w:rPr>
+        <w:t xml:space="preserve"> </w:t>
+      </w:r>
+      <w:r>
+        <w:rPr>
+          <w:b/>
+          <w:bCs/>
+          <w:rtl/>
+        </w:rPr>
+        <w:t xml:space="preserve">נגמר</w:t>
       </w:r>
       <w:r>
         <w:rPr>
@@ -4255,23 +4408,7 @@
           <w:bCs/>
           <w:rtl/>
         </w:rPr>
-        <w:t xml:space="preserve">שלא אוותר באמצע</w:t>
-      </w:r>
-      <w:r>
-        <w:rPr>
-          <w:b/>
-          <w:bCs/>
-          <w:rtl/>
-        </w:rPr>
-        <w:t xml:space="preserve"> </w:t>
-      </w:r>
-      <w:r>
-        <w:rPr>
-          <w:b/>
-          <w:bCs/>
-          <w:rtl/>
-        </w:rPr>
-        <w:t xml:space="preserve">ההזמנה ואחזור לעמוד בתור</w:t>
+        <w:t xml:space="preserve">לטפל בהן לפני שהמנות מצטברות על הדלפק</w:t>
       </w:r>
       <w:r>
         <w:rPr>
@@ -4307,7 +4444,19 @@
         <w:rPr>
           <w:rtl/>
         </w:rPr>
-        <w:t xml:space="preserve">500 הזמנות במקביל בין 12:00–14:00, כשזמן התגובה ≤ 2 שניות.</w:t>
+        <w:t xml:space="preserve">בתום חלון האיסוף, הזמנה בסטטוס ״מוכנה״ שלא נמסרה מזוהה כ״לא נאספה״, בלי שאיש מפעיל את</w:t>
+      </w:r>
+      <w:r>
+        <w:rPr>
+          <w:rtl/>
+        </w:rPr>
+        <w:t xml:space="preserve"> </w:t>
+      </w:r>
+      <w:r>
+        <w:rPr>
+          <w:rtl/>
+        </w:rPr>
+        <w:t xml:space="preserve">הבדיקה.</w:t>
       </w:r>
     </w:p>
     <w:p>
@@ -4323,7 +4472,42 @@
         <w:rPr>
           <w:rtl/>
         </w:rPr>
-        <w:t xml:space="preserve">נמדד בבדיקת עומס המדמה את חלון השיא, ולא בהערכה.</w:t>
+        <w:t xml:space="preserve">המנהל רואה את רשימת ההזמנות שלא נאספו, עם מועד ההזמנה, הסכום ופרטי הסטודנט המזמין.</w:t>
+      </w:r>
+    </w:p>
+    <w:p>
+      <w:pPr>
+        <w:pStyle w:val="Compact"/>
+        <w:numPr>
+          <w:ilvl w:val="0"/>
+          <w:numId w:val="1014"/>
+        </w:numPr>
+        <w:bidi/>
+      </w:pPr>
+      <w:r>
+        <w:rPr>
+          <w:rtl/>
+        </w:rPr>
+        <w:t xml:space="preserve">מה עושים בהזמנה (זיכוי, חיוב או חסימה) אינו חלק מהסיפור עד שתוכרע</w:t>
+      </w:r>
+      <w:r>
+        <w:rPr>
+          <w:rtl/>
+        </w:rPr>
+        <w:t xml:space="preserve"> </w:t>
+      </w:r>
+      <w:r>
+        <w:rPr>
+          <w:rStyle w:val="VerbatimChar"/>
+          <w:rtl/>
+        </w:rPr>
+        <w:t xml:space="preserve">BR-3</w:t>
+      </w:r>
+      <w:r>
+        <w:rPr>
+          <w:rtl/>
+        </w:rPr>
+        <w:t xml:space="preserve">.</w:t>
       </w:r>
     </w:p>
     <w:p>
@@ -4337,7 +4521,7 @@
           <w:iCs/>
           <w:rtl/>
         </w:rPr>
-        <w:t xml:space="preserve">מקביל ל-</w:t>
+        <w:t xml:space="preserve">מקור: ראיונות המנהל והדלפק · מקביל ל-</w:t>
       </w:r>
       <w:r>
         <w:rPr>
@@ -4346,7 +4530,7 @@
           <w:iCs/>
           <w:rtl/>
         </w:rPr>
-        <w:t xml:space="preserve">NFR-1</w:t>
+        <w:t xml:space="preserve">FR-12</w:t>
       </w:r>
       <w:r>
         <w:rPr>
@@ -4357,8 +4541,79 @@
         <w:t xml:space="preserve">.</w:t>
       </w:r>
     </w:p>
+    <w:p>
+      <w:pPr>
+        <w:bidi/>
+      </w:pPr>
+      <w:r>
+        <w:rPr>
+          <w:rtl/>
+        </w:rPr>
+        <w:pict>
+          <v:rect style="width:0;height:1.5pt" o:hralign="center" o:hrstd="t" o:hr="t"/>
+        </w:pict>
+      </w:r>
+    </w:p>
     <w:bookmarkEnd w:id="28"/>
-    <w:bookmarkStart w:id="29" w:name="us-14--הזמנה-שנכנסת-לתוך-ההפסקה--must"/>
+    <w:bookmarkEnd w:id="29"/>
+    <w:bookmarkStart w:id="35" w:name="הסיפורים-דרישות-לא-פונקציונליות"/>
+    <w:p>
+      <w:pPr>
+        <w:pStyle w:val="Heading2"/>
+        <w:bidi/>
+      </w:pPr>
+      <w:r>
+        <w:rPr>
+          <w:rtl/>
+        </w:rPr>
+        <w:t xml:space="preserve">הסיפורים: דרישות לא-פונקציונליות</w:t>
+      </w:r>
+    </w:p>
+    <w:p>
+      <w:pPr>
+        <w:pStyle w:val="BlockText"/>
+        <w:bidi/>
+      </w:pPr>
+      <w:r>
+        <w:rPr>
+          <w:rtl/>
+        </w:rPr>
+        <w:t xml:space="preserve">כל דרישה לא-פונקציונלית מנוסחת גם כסיפור: מישהו הגדיר אותה ויש לו סיבה, והוא ה״כ...״ של</w:t>
+      </w:r>
+      <w:r>
+        <w:rPr>
+          <w:rtl/>
+        </w:rPr>
+        <w:t xml:space="preserve"> </w:t>
+      </w:r>
+      <w:r>
+        <w:rPr>
+          <w:rtl/>
+        </w:rPr>
+        <w:t xml:space="preserve">הסיפור. התנאים נושאים את</w:t>
+      </w:r>
+      <w:r>
+        <w:rPr>
+          <w:rtl/>
+        </w:rPr>
+        <w:t xml:space="preserve"> </w:t>
+      </w:r>
+      <w:r>
+        <w:rPr>
+          <w:b/>
+          <w:bCs/>
+          <w:rtl/>
+        </w:rPr>
+        <w:t xml:space="preserve">המדד</w:t>
+      </w:r>
+      <w:r>
+        <w:rPr>
+          <w:rtl/>
+        </w:rPr>
+        <w:t xml:space="preserve">; בלי מדד זו משאלה, לא דרישה.</w:t>
+      </w:r>
+    </w:p>
+    <w:bookmarkStart w:id="30" w:name="Xa033c525d699a11f1e8eea6ee5080c34d24c456"/>
     <w:p>
       <w:pPr>
         <w:pStyle w:val="Heading3"/>
@@ -4368,7 +4623,7 @@
         <w:rPr>
           <w:rtl/>
         </w:rPr>
-        <w:t xml:space="preserve">US-14 · הזמנה שנכנסת לתוך ההפסקה —</w:t>
+        <w:t xml:space="preserve">US-14 · המערכת מגיבה גם בשיא הצהריים —</w:t>
       </w:r>
       <w:r>
         <w:rPr>
@@ -4402,7 +4657,7 @@
           <w:bCs/>
           <w:rtl/>
         </w:rPr>
-        <w:t xml:space="preserve">סטודנטית</w:t>
+        <w:t xml:space="preserve">סטודנט</w:t>
       </w:r>
       <w:r>
         <w:rPr>
@@ -4422,39 +4677,43 @@
           <w:bCs/>
           <w:rtl/>
         </w:rPr>
-        <w:t xml:space="preserve">להשלים הזמנה מבחירת המנה ועד אישור התשלום בפחות מדקה וחצי</w:t>
-      </w:r>
-      <w:r>
-        <w:rPr>
-          <w:rtl/>
-        </w:rPr>
-        <w:t xml:space="preserve">,</w:t>
-      </w:r>
-      <w:r>
-        <w:rPr>
-          <w:rtl/>
-        </w:rPr>
-        <w:t xml:space="preserve"> </w:t>
-      </w:r>
-      <w:r>
-        <w:rPr>
-          <w:rtl/>
-        </w:rPr>
-        <w:t xml:space="preserve">כדי</w:t>
-      </w:r>
-      <w:r>
-        <w:rPr>
-          <w:rtl/>
-        </w:rPr>
-        <w:t xml:space="preserve"> </w:t>
-      </w:r>
-      <w:r>
-        <w:rPr>
-          <w:b/>
-          <w:bCs/>
-          <w:rtl/>
-        </w:rPr>
-        <w:t xml:space="preserve">שכל ההזמנה תיכנס לתוך ההפסקה הקצרה</w:t>
+        <w:t xml:space="preserve">שהמערכת תגיב מיד גם בעומס של 12:00</w:t>
+      </w:r>
+      <w:r>
+        <w:rPr>
+          <w:rtl/>
+        </w:rPr>
+        <w:t xml:space="preserve">, כדי</w:t>
+      </w:r>
+      <w:r>
+        <w:rPr>
+          <w:rtl/>
+        </w:rPr>
+        <w:t xml:space="preserve"> </w:t>
+      </w:r>
+      <w:r>
+        <w:rPr>
+          <w:b/>
+          <w:bCs/>
+          <w:rtl/>
+        </w:rPr>
+        <w:t xml:space="preserve">שלא אוותר באמצע</w:t>
+      </w:r>
+      <w:r>
+        <w:rPr>
+          <w:b/>
+          <w:bCs/>
+          <w:rtl/>
+        </w:rPr>
+        <w:t xml:space="preserve"> </w:t>
+      </w:r>
+      <w:r>
+        <w:rPr>
+          <w:b/>
+          <w:bCs/>
+          <w:rtl/>
+        </w:rPr>
+        <w:t xml:space="preserve">ההזמנה ואחזור לעמוד בתור</w:t>
       </w:r>
       <w:r>
         <w:rPr>
@@ -4490,7 +4749,7 @@
         <w:rPr>
           <w:rtl/>
         </w:rPr>
-        <w:t xml:space="preserve">תהליך הזמנה מלא מקצה לקצה ≤ 90 שניות.</w:t>
+        <w:t xml:space="preserve">500 הזמנות במקביל בין 12:00–14:00, כשזמן התגובה ≤ 2 שניות.</w:t>
       </w:r>
     </w:p>
     <w:p>
@@ -4506,7 +4765,7 @@
         <w:rPr>
           <w:rtl/>
         </w:rPr>
-        <w:t xml:space="preserve">נמדד גם בשעת השיא, לא רק בשעה שקטה.</w:t>
+        <w:t xml:space="preserve">נמדד בבדיקת עומס המדמה את חלון השיא, ולא בהערכה.</w:t>
       </w:r>
     </w:p>
     <w:p>
@@ -4529,27 +4788,19 @@
           <w:iCs/>
           <w:rtl/>
         </w:rPr>
-        <w:t xml:space="preserve">NFR-2</w:t>
-      </w:r>
-      <w:r>
-        <w:rPr>
-          <w:i/>
-          <w:iCs/>
-          <w:rtl/>
-        </w:rPr>
-        <w:t xml:space="preserve"> </w:t>
-      </w:r>
-      <w:r>
-        <w:rPr>
-          <w:i/>
-          <w:iCs/>
-          <w:rtl/>
-        </w:rPr>
-        <w:t xml:space="preserve">· קשור ל-US-1 (אותו מסע, כאן מזווית הזמן).</w:t>
-      </w:r>
-    </w:p>
-    <w:bookmarkEnd w:id="29"/>
-    <w:bookmarkStart w:id="30" w:name="Xf41887b51841ae045a0a6f59e227fb1fa71a42b"/>
+        <w:t xml:space="preserve">NFR-1</w:t>
+      </w:r>
+      <w:r>
+        <w:rPr>
+          <w:i/>
+          <w:iCs/>
+          <w:rtl/>
+        </w:rPr>
+        <w:t xml:space="preserve">.</w:t>
+      </w:r>
+    </w:p>
+    <w:bookmarkEnd w:id="30"/>
+    <w:bookmarkStart w:id="31" w:name="us-15--הזמנה-שנכנסת-לתוך-ההפסקה--must"/>
     <w:p>
       <w:pPr>
         <w:pStyle w:val="Heading3"/>
@@ -4559,7 +4810,7 @@
         <w:rPr>
           <w:rtl/>
         </w:rPr>
-        <w:t xml:space="preserve">US-15 · בלי למסור פרטי אשראי לקפיטריה —</w:t>
+        <w:t xml:space="preserve">US-15 · הזמנה שנכנסת לתוך ההפסקה —</w:t>
       </w:r>
       <w:r>
         <w:rPr>
@@ -4593,7 +4844,7 @@
           <w:bCs/>
           <w:rtl/>
         </w:rPr>
-        <w:t xml:space="preserve">סטודנט</w:t>
+        <w:t xml:space="preserve">סטודנטית</w:t>
       </w:r>
       <w:r>
         <w:rPr>
@@ -4613,43 +4864,39 @@
           <w:bCs/>
           <w:rtl/>
         </w:rPr>
-        <w:t xml:space="preserve">להיכנס עם הזיהוי של האוניברסיטה ולא להשאיר פרטי כרטיס במערכת</w:t>
-      </w:r>
-      <w:r>
-        <w:rPr>
-          <w:b/>
-          <w:bCs/>
-          <w:rtl/>
-        </w:rPr>
-        <w:t xml:space="preserve"> </w:t>
-      </w:r>
-      <w:r>
-        <w:rPr>
-          <w:b/>
-          <w:bCs/>
-          <w:rtl/>
-        </w:rPr>
-        <w:t xml:space="preserve">של הקפיטריה</w:t>
-      </w:r>
-      <w:r>
-        <w:rPr>
-          <w:rtl/>
-        </w:rPr>
-        <w:t xml:space="preserve">, כדי</w:t>
-      </w:r>
-      <w:r>
-        <w:rPr>
-          <w:rtl/>
-        </w:rPr>
-        <w:t xml:space="preserve"> </w:t>
-      </w:r>
-      <w:r>
-        <w:rPr>
-          <w:b/>
-          <w:bCs/>
-          <w:rtl/>
-        </w:rPr>
-        <w:t xml:space="preserve">שלא אצטרך לסמוך עליה בשמירת הפרטים שלי</w:t>
+        <w:t xml:space="preserve">להשלים הזמנה מבחירת המנה ועד אישור התשלום בפחות מדקה וחצי</w:t>
+      </w:r>
+      <w:r>
+        <w:rPr>
+          <w:rtl/>
+        </w:rPr>
+        <w:t xml:space="preserve">,</w:t>
+      </w:r>
+      <w:r>
+        <w:rPr>
+          <w:rtl/>
+        </w:rPr>
+        <w:t xml:space="preserve"> </w:t>
+      </w:r>
+      <w:r>
+        <w:rPr>
+          <w:rtl/>
+        </w:rPr>
+        <w:t xml:space="preserve">כדי</w:t>
+      </w:r>
+      <w:r>
+        <w:rPr>
+          <w:rtl/>
+        </w:rPr>
+        <w:t xml:space="preserve"> </w:t>
+      </w:r>
+      <w:r>
+        <w:rPr>
+          <w:b/>
+          <w:bCs/>
+          <w:rtl/>
+        </w:rPr>
+        <w:t xml:space="preserve">שכל ההזמנה תיכנס לתוך ההפסקה הקצרה</w:t>
       </w:r>
       <w:r>
         <w:rPr>
@@ -4685,7 +4932,7 @@
         <w:rPr>
           <w:rtl/>
         </w:rPr>
-        <w:t xml:space="preserve">כל כניסה עוברת דרך זיהוי האוניברסיטה — אין מסך הרשמה נפרד ואין סיסמה משלנו.</w:t>
+        <w:t xml:space="preserve">תהליך הזמנה מלא מקצה לקצה ≤ 90 שניות.</w:t>
       </w:r>
     </w:p>
     <w:p>
@@ -4701,7 +4948,7 @@
         <w:rPr>
           <w:rtl/>
         </w:rPr>
-        <w:t xml:space="preserve">במסד הנתונים אין שדה סיסמה ואין פרטי כרטיס; נשמרת אסמכתת שער התשלום בלבד.</w:t>
+        <w:t xml:space="preserve">נמדד גם בשעת השיא, לא רק בשעה שקטה.</w:t>
       </w:r>
     </w:p>
     <w:p>
@@ -4724,27 +4971,27 @@
           <w:iCs/>
           <w:rtl/>
         </w:rPr>
-        <w:t xml:space="preserve">NFR-3</w:t>
-      </w:r>
-      <w:r>
-        <w:rPr>
-          <w:i/>
-          <w:iCs/>
-          <w:rtl/>
-        </w:rPr>
-        <w:t xml:space="preserve"> </w:t>
-      </w:r>
-      <w:r>
-        <w:rPr>
-          <w:i/>
-          <w:iCs/>
-          <w:rtl/>
-        </w:rPr>
-        <w:t xml:space="preserve">· ראו ישות ״תשלום״ במילון הנתונים.</w:t>
-      </w:r>
-    </w:p>
-    <w:bookmarkEnd w:id="30"/>
-    <w:bookmarkStart w:id="31" w:name="X19d50a092b63c7a13db2ee9283129b633e52e8c"/>
+        <w:t xml:space="preserve">NFR-2</w:t>
+      </w:r>
+      <w:r>
+        <w:rPr>
+          <w:i/>
+          <w:iCs/>
+          <w:rtl/>
+        </w:rPr>
+        <w:t xml:space="preserve"> </w:t>
+      </w:r>
+      <w:r>
+        <w:rPr>
+          <w:i/>
+          <w:iCs/>
+          <w:rtl/>
+        </w:rPr>
+        <w:t xml:space="preserve">· קשור ל-US-1 (אותו מסע, כאן מזווית הזמן).</w:t>
+      </w:r>
+    </w:p>
+    <w:bookmarkEnd w:id="31"/>
+    <w:bookmarkStart w:id="32" w:name="X1f5a8e2ca6444223572b0da7fbf9615251bf1f6"/>
     <w:p>
       <w:pPr>
         <w:pStyle w:val="Heading3"/>
@@ -4754,7 +5001,7 @@
         <w:rPr>
           <w:rtl/>
         </w:rPr>
-        <w:t xml:space="preserve">US-16 · המערכת זמינה כל עוד הקפיטריה פתוחה —</w:t>
+        <w:t xml:space="preserve">US-16 · בלי למסור פרטי אשראי לקפיטריה —</w:t>
       </w:r>
       <w:r>
         <w:rPr>
@@ -4788,7 +5035,7 @@
           <w:bCs/>
           <w:rtl/>
         </w:rPr>
-        <w:t xml:space="preserve">מנהל קפיטריה</w:t>
+        <w:t xml:space="preserve">סטודנט</w:t>
       </w:r>
       <w:r>
         <w:rPr>
@@ -4808,7 +5055,23 @@
           <w:bCs/>
           <w:rtl/>
         </w:rPr>
-        <w:t xml:space="preserve">שהמערכת תהיה זמינה לאורך כל שעות הפעילות</w:t>
+        <w:t xml:space="preserve">להיכנס עם הזיהוי של האוניברסיטה ולא להשאיר פרטי כרטיס במערכת</w:t>
+      </w:r>
+      <w:r>
+        <w:rPr>
+          <w:b/>
+          <w:bCs/>
+          <w:rtl/>
+        </w:rPr>
+        <w:t xml:space="preserve"> </w:t>
+      </w:r>
+      <w:r>
+        <w:rPr>
+          <w:b/>
+          <w:bCs/>
+          <w:rtl/>
+        </w:rPr>
+        <w:t xml:space="preserve">של הקפיטריה</w:t>
       </w:r>
       <w:r>
         <w:rPr>
@@ -4828,23 +5091,7 @@
           <w:bCs/>
           <w:rtl/>
         </w:rPr>
-        <w:t xml:space="preserve">שלא</w:t>
-      </w:r>
-      <w:r>
-        <w:rPr>
-          <w:b/>
-          <w:bCs/>
-          <w:rtl/>
-        </w:rPr>
-        <w:t xml:space="preserve"> </w:t>
-      </w:r>
-      <w:r>
-        <w:rPr>
-          <w:b/>
-          <w:bCs/>
-          <w:rtl/>
-        </w:rPr>
-        <w:t xml:space="preserve">אחזור לפתקים ולדף ועט באמצע יום עבודה</w:t>
+        <w:t xml:space="preserve">שלא אצטרך לסמוך עליה בשמירת הפרטים שלי</w:t>
       </w:r>
       <w:r>
         <w:rPr>
@@ -4880,7 +5127,7 @@
         <w:rPr>
           <w:rtl/>
         </w:rPr>
-        <w:t xml:space="preserve">99.5% זמינות בין 08:00–20:00.</w:t>
+        <w:t xml:space="preserve">כל כניסה עוברת דרך זיהוי האוניברסיטה — אין מסך הרשמה נפרד ואין סיסמה משלנו.</w:t>
       </w:r>
     </w:p>
     <w:p>
@@ -4896,6 +5143,201 @@
         <w:rPr>
           <w:rtl/>
         </w:rPr>
+        <w:t xml:space="preserve">במסד הנתונים אין שדה סיסמה ואין פרטי כרטיס; נשמרת אסמכתת שער התשלום בלבד.</w:t>
+      </w:r>
+    </w:p>
+    <w:p>
+      <w:pPr>
+        <w:pStyle w:val="FirstParagraph"/>
+        <w:bidi/>
+      </w:pPr>
+      <w:r>
+        <w:rPr>
+          <w:i/>
+          <w:iCs/>
+          <w:rtl/>
+        </w:rPr>
+        <w:t xml:space="preserve">מקביל ל-</w:t>
+      </w:r>
+      <w:r>
+        <w:rPr>
+          <w:rStyle w:val="VerbatimChar"/>
+          <w:i/>
+          <w:iCs/>
+          <w:rtl/>
+        </w:rPr>
+        <w:t xml:space="preserve">NFR-3</w:t>
+      </w:r>
+      <w:r>
+        <w:rPr>
+          <w:i/>
+          <w:iCs/>
+          <w:rtl/>
+        </w:rPr>
+        <w:t xml:space="preserve"> </w:t>
+      </w:r>
+      <w:r>
+        <w:rPr>
+          <w:i/>
+          <w:iCs/>
+          <w:rtl/>
+        </w:rPr>
+        <w:t xml:space="preserve">· ראו ישות ״תשלום״ במילון הנתונים.</w:t>
+      </w:r>
+    </w:p>
+    <w:bookmarkEnd w:id="32"/>
+    <w:bookmarkStart w:id="33" w:name="X6c5ce85254ec27bfe3cf4be1d3c14d78aca7583"/>
+    <w:p>
+      <w:pPr>
+        <w:pStyle w:val="Heading3"/>
+        <w:bidi/>
+      </w:pPr>
+      <w:r>
+        <w:rPr>
+          <w:rtl/>
+        </w:rPr>
+        <w:t xml:space="preserve">US-17 · המערכת זמינה כל עוד הקפיטריה פתוחה —</w:t>
+      </w:r>
+      <w:r>
+        <w:rPr>
+          <w:rtl/>
+        </w:rPr>
+        <w:t xml:space="preserve"> </w:t>
+      </w:r>
+      <w:r>
+        <w:rPr>
+          <w:b/>
+          <w:bCs/>
+          <w:rtl/>
+        </w:rPr>
+        <w:t xml:space="preserve">Must</w:t>
+      </w:r>
+    </w:p>
+    <w:p>
+      <w:pPr>
+        <w:pStyle w:val="BlockText"/>
+        <w:bidi/>
+      </w:pPr>
+      <w:r>
+        <w:rPr>
+          <w:rtl/>
+        </w:rPr>
+        <w:t xml:space="preserve">״כ</w:t>
+      </w:r>
+      <w:r>
+        <w:rPr>
+          <w:b/>
+          <w:bCs/>
+          <w:rtl/>
+        </w:rPr>
+        <w:t xml:space="preserve">מנהל קפיטריה</w:t>
+      </w:r>
+      <w:r>
+        <w:rPr>
+          <w:rtl/>
+        </w:rPr>
+        <w:t xml:space="preserve">, אני רוצה</w:t>
+      </w:r>
+      <w:r>
+        <w:rPr>
+          <w:rtl/>
+        </w:rPr>
+        <w:t xml:space="preserve"> </w:t>
+      </w:r>
+      <w:r>
+        <w:rPr>
+          <w:b/>
+          <w:bCs/>
+          <w:rtl/>
+        </w:rPr>
+        <w:t xml:space="preserve">שהמערכת תהיה זמינה לאורך כל שעות הפעילות</w:t>
+      </w:r>
+      <w:r>
+        <w:rPr>
+          <w:rtl/>
+        </w:rPr>
+        <w:t xml:space="preserve">, כדי</w:t>
+      </w:r>
+      <w:r>
+        <w:rPr>
+          <w:rtl/>
+        </w:rPr>
+        <w:t xml:space="preserve"> </w:t>
+      </w:r>
+      <w:r>
+        <w:rPr>
+          <w:b/>
+          <w:bCs/>
+          <w:rtl/>
+        </w:rPr>
+        <w:t xml:space="preserve">שלא</w:t>
+      </w:r>
+      <w:r>
+        <w:rPr>
+          <w:b/>
+          <w:bCs/>
+          <w:rtl/>
+        </w:rPr>
+        <w:t xml:space="preserve"> </w:t>
+      </w:r>
+      <w:r>
+        <w:rPr>
+          <w:b/>
+          <w:bCs/>
+          <w:rtl/>
+        </w:rPr>
+        <w:t xml:space="preserve">אחזור לפתקים ולדף ועט באמצע יום עבודה</w:t>
+      </w:r>
+      <w:r>
+        <w:rPr>
+          <w:rtl/>
+        </w:rPr>
+        <w:t xml:space="preserve">.״</w:t>
+      </w:r>
+    </w:p>
+    <w:p>
+      <w:pPr>
+        <w:pStyle w:val="FirstParagraph"/>
+        <w:bidi/>
+      </w:pPr>
+      <w:r>
+        <w:rPr>
+          <w:b/>
+          <w:bCs/>
+          <w:rtl/>
+        </w:rPr>
+        <w:t xml:space="preserve">תנאי קבלה:</w:t>
+      </w:r>
+    </w:p>
+    <w:p>
+      <w:pPr>
+        <w:pStyle w:val="Compact"/>
+        <w:numPr>
+          <w:ilvl w:val="0"/>
+          <w:numId w:val="1018"/>
+        </w:numPr>
+        <w:bidi/>
+      </w:pPr>
+      <w:r>
+        <w:rPr>
+          <w:rtl/>
+        </w:rPr>
+        <w:t xml:space="preserve">99.5% זמינות בין 08:00–20:00.</w:t>
+      </w:r>
+    </w:p>
+    <w:p>
+      <w:pPr>
+        <w:pStyle w:val="Compact"/>
+        <w:numPr>
+          <w:ilvl w:val="0"/>
+          <w:numId w:val="1018"/>
+        </w:numPr>
+        <w:bidi/>
+      </w:pPr>
+      <w:r>
+        <w:rPr>
+          <w:rtl/>
+        </w:rPr>
         <w:t xml:space="preserve">ניטור רציף בשעות הפעילות וחישוב האחוז מדי חודש.</w:t>
       </w:r>
     </w:p>
@@ -4920,6 +5362,218 @@
           <w:rtl/>
         </w:rPr>
         <w:t xml:space="preserve">NFR-5</w:t>
+      </w:r>
+      <w:r>
+        <w:rPr>
+          <w:i/>
+          <w:iCs/>
+          <w:rtl/>
+        </w:rPr>
+        <w:t xml:space="preserve">.</w:t>
+      </w:r>
+    </w:p>
+    <w:bookmarkEnd w:id="33"/>
+    <w:bookmarkStart w:id="34" w:name="us-18--כל-הקמפוס-יכול-להזמין--must"/>
+    <w:p>
+      <w:pPr>
+        <w:pStyle w:val="Heading3"/>
+        <w:bidi/>
+      </w:pPr>
+      <w:r>
+        <w:rPr>
+          <w:rtl/>
+        </w:rPr>
+        <w:t xml:space="preserve">US-18 · כל הקמפוס יכול להזמין —</w:t>
+      </w:r>
+      <w:r>
+        <w:rPr>
+          <w:rtl/>
+        </w:rPr>
+        <w:t xml:space="preserve"> </w:t>
+      </w:r>
+      <w:r>
+        <w:rPr>
+          <w:b/>
+          <w:bCs/>
+          <w:rtl/>
+        </w:rPr>
+        <w:t xml:space="preserve">Must</w:t>
+      </w:r>
+    </w:p>
+    <w:p>
+      <w:pPr>
+        <w:pStyle w:val="BlockText"/>
+        <w:bidi/>
+      </w:pPr>
+      <w:r>
+        <w:rPr>
+          <w:rtl/>
+        </w:rPr>
+        <w:t xml:space="preserve">״כ</w:t>
+      </w:r>
+      <w:r>
+        <w:rPr>
+          <w:b/>
+          <w:bCs/>
+          <w:rtl/>
+        </w:rPr>
+        <w:t xml:space="preserve">מנהל הקפיטריה</w:t>
+      </w:r>
+      <w:r>
+        <w:rPr>
+          <w:rtl/>
+        </w:rPr>
+        <w:t xml:space="preserve">, אני רוצה</w:t>
+      </w:r>
+      <w:r>
+        <w:rPr>
+          <w:rtl/>
+        </w:rPr>
+        <w:t xml:space="preserve"> </w:t>
+      </w:r>
+      <w:r>
+        <w:rPr>
+          <w:b/>
+          <w:bCs/>
+          <w:rtl/>
+        </w:rPr>
+        <w:t xml:space="preserve">שהמערכת תשרת את כל 5000 הסטודנטים בקמפוס</w:t>
+      </w:r>
+      <w:r>
+        <w:rPr>
+          <w:rtl/>
+        </w:rPr>
+        <w:t xml:space="preserve">, כדי</w:t>
+      </w:r>
+      <w:r>
+        <w:rPr>
+          <w:rtl/>
+        </w:rPr>
+        <w:t xml:space="preserve"> </w:t>
+      </w:r>
+      <w:r>
+        <w:rPr>
+          <w:b/>
+          <w:bCs/>
+          <w:rtl/>
+        </w:rPr>
+        <w:t xml:space="preserve">לפתוח</w:t>
+      </w:r>
+      <w:r>
+        <w:rPr>
+          <w:b/>
+          <w:bCs/>
+          <w:rtl/>
+        </w:rPr>
+        <w:t xml:space="preserve"> </w:t>
+      </w:r>
+      <w:r>
+        <w:rPr>
+          <w:b/>
+          <w:bCs/>
+          <w:rtl/>
+        </w:rPr>
+        <w:t xml:space="preserve">את ההזמנה מראש לכולם בלי להגביל את מספר הנרשמים</w:t>
+      </w:r>
+      <w:r>
+        <w:rPr>
+          <w:rtl/>
+        </w:rPr>
+        <w:t xml:space="preserve">.״</w:t>
+      </w:r>
+    </w:p>
+    <w:p>
+      <w:pPr>
+        <w:pStyle w:val="FirstParagraph"/>
+        <w:bidi/>
+      </w:pPr>
+      <w:r>
+        <w:rPr>
+          <w:b/>
+          <w:bCs/>
+          <w:rtl/>
+        </w:rPr>
+        <w:t xml:space="preserve">תנאי קבלה:</w:t>
+      </w:r>
+    </w:p>
+    <w:p>
+      <w:pPr>
+        <w:pStyle w:val="Compact"/>
+        <w:numPr>
+          <w:ilvl w:val="0"/>
+          <w:numId w:val="1019"/>
+        </w:numPr>
+        <w:bidi/>
+      </w:pPr>
+      <w:r>
+        <w:rPr>
+          <w:rtl/>
+        </w:rPr>
+        <w:t xml:space="preserve">5000 רשומות סטודנט נטענות בממשק היומי בלי שגיאה.</w:t>
+      </w:r>
+    </w:p>
+    <w:p>
+      <w:pPr>
+        <w:pStyle w:val="Compact"/>
+        <w:numPr>
+          <w:ilvl w:val="0"/>
+          <w:numId w:val="1019"/>
+        </w:numPr>
+        <w:bidi/>
+      </w:pPr>
+      <w:r>
+        <w:rPr>
+          <w:rtl/>
+        </w:rPr>
+        <w:t xml:space="preserve">בדיקת העומס של</w:t>
+      </w:r>
+      <w:r>
+        <w:rPr>
+          <w:rtl/>
+        </w:rPr>
+        <w:t xml:space="preserve"> </w:t>
+      </w:r>
+      <w:r>
+        <w:rPr>
+          <w:rStyle w:val="VerbatimChar"/>
+          <w:rtl/>
+        </w:rPr>
+        <w:t xml:space="preserve">NFR-1</w:t>
+      </w:r>
+      <w:r>
+        <w:rPr>
+          <w:rtl/>
+        </w:rPr>
+        <w:t xml:space="preserve"> </w:t>
+      </w:r>
+      <w:r>
+        <w:rPr>
+          <w:rtl/>
+        </w:rPr>
+        <w:t xml:space="preserve">עוברת גם כשכל 5000 הרשומות טעונות.</w:t>
+      </w:r>
+    </w:p>
+    <w:p>
+      <w:pPr>
+        <w:pStyle w:val="FirstParagraph"/>
+        <w:bidi/>
+      </w:pPr>
+      <w:r>
+        <w:rPr>
+          <w:i/>
+          <w:iCs/>
+          <w:rtl/>
+        </w:rPr>
+        <w:t xml:space="preserve">מקביל ל-</w:t>
+      </w:r>
+      <w:r>
+        <w:rPr>
+          <w:rStyle w:val="VerbatimChar"/>
+          <w:i/>
+          <w:iCs/>
+          <w:rtl/>
+        </w:rPr>
+        <w:t xml:space="preserve">NFR-4</w:t>
       </w:r>
       <w:r>
         <w:rPr>
@@ -4943,9 +5597,9 @@
         </w:pict>
       </w:r>
     </w:p>
-    <w:bookmarkEnd w:id="31"/>
-    <w:bookmarkEnd w:id="32"/>
-    <w:bookmarkStart w:id="35" w:name="טבלת-עקיבות--סיפור--דרישות"/>
+    <w:bookmarkEnd w:id="34"/>
+    <w:bookmarkEnd w:id="35"/>
+    <w:bookmarkStart w:id="38" w:name="טבלת-עקיבות--סיפור--דרישות"/>
     <w:p>
       <w:pPr>
         <w:pStyle w:val="Heading2"/>
@@ -5932,7 +6586,7 @@
               <w:rPr>
                 <w:rtl/>
               </w:rPr>
-              <w:t xml:space="preserve">תגובה בשיא הצהריים</w:t>
+              <w:t xml:space="preserve">הזמנות שלא נאספו</w:t>
             </w:r>
           </w:p>
         </w:tc>
@@ -5948,7 +6602,7 @@
                 <w:rStyle w:val="VerbatimChar"/>
                 <w:rtl/>
               </w:rPr>
-              <w:t xml:space="preserve">NFR-1</w:t>
+              <w:t xml:space="preserve">FR-12</w:t>
             </w:r>
           </w:p>
         </w:tc>
@@ -5996,7 +6650,7 @@
               <w:rPr>
                 <w:rtl/>
               </w:rPr>
-              <w:t xml:space="preserve">הזמנה שנכנסת לתוך ההפסקה</w:t>
+              <w:t xml:space="preserve">תגובה בשיא הצהריים</w:t>
             </w:r>
           </w:p>
         </w:tc>
@@ -6012,7 +6666,7 @@
                 <w:rStyle w:val="VerbatimChar"/>
                 <w:rtl/>
               </w:rPr>
-              <w:t xml:space="preserve">NFR-2</w:t>
+              <w:t xml:space="preserve">NFR-1</w:t>
             </w:r>
           </w:p>
         </w:tc>
@@ -6060,7 +6714,7 @@
               <w:rPr>
                 <w:rtl/>
               </w:rPr>
-              <w:t xml:space="preserve">בלי למסור פרטי אשראי</w:t>
+              <w:t xml:space="preserve">הזמנה שנכנסת לתוך ההפסקה</w:t>
             </w:r>
           </w:p>
         </w:tc>
@@ -6076,7 +6730,7 @@
                 <w:rStyle w:val="VerbatimChar"/>
                 <w:rtl/>
               </w:rPr>
-              <w:t xml:space="preserve">NFR-3</w:t>
+              <w:t xml:space="preserve">NFR-2</w:t>
             </w:r>
           </w:p>
         </w:tc>
@@ -6124,7 +6778,7 @@
               <w:rPr>
                 <w:rtl/>
               </w:rPr>
-              <w:t xml:space="preserve">זמינות בשעות הפעילות</w:t>
+              <w:t xml:space="preserve">בלי למסור פרטי אשראי</w:t>
             </w:r>
           </w:p>
         </w:tc>
@@ -6140,7 +6794,7 @@
                 <w:rStyle w:val="VerbatimChar"/>
                 <w:rtl/>
               </w:rPr>
-              <w:t xml:space="preserve">NFR-5</w:t>
+              <w:t xml:space="preserve">NFR-3</w:t>
             </w:r>
           </w:p>
         </w:tc>
@@ -6161,8 +6815,136 @@
           </w:p>
         </w:tc>
       </w:tr>
+      <w:tr>
+        <w:tc>
+          <w:tcPr/>
+          <w:p>
+            <w:pPr>
+              <w:pStyle w:val="Compact"/>
+              <w:bidi/>
+            </w:pPr>
+            <w:r>
+              <w:rPr>
+                <w:rtl/>
+              </w:rPr>
+              <w:t xml:space="preserve">US-17</w:t>
+            </w:r>
+          </w:p>
+        </w:tc>
+        <w:tc>
+          <w:tcPr/>
+          <w:p>
+            <w:pPr>
+              <w:pStyle w:val="Compact"/>
+              <w:bidi/>
+            </w:pPr>
+            <w:r>
+              <w:rPr>
+                <w:rtl/>
+              </w:rPr>
+              <w:t xml:space="preserve">זמינות בשעות הפעילות</w:t>
+            </w:r>
+          </w:p>
+        </w:tc>
+        <w:tc>
+          <w:tcPr/>
+          <w:p>
+            <w:pPr>
+              <w:pStyle w:val="Compact"/>
+              <w:bidi/>
+            </w:pPr>
+            <w:r>
+              <w:rPr>
+                <w:rStyle w:val="VerbatimChar"/>
+                <w:rtl/>
+              </w:rPr>
+              <w:t xml:space="preserve">NFR-5</w:t>
+            </w:r>
+          </w:p>
+        </w:tc>
+        <w:tc>
+          <w:tcPr/>
+          <w:p>
+            <w:pPr>
+              <w:pStyle w:val="Compact"/>
+              <w:bidi/>
+              <w:jc w:val="center"/>
+            </w:pPr>
+            <w:r>
+              <w:rPr>
+                <w:rtl/>
+              </w:rPr>
+              <w:t xml:space="preserve">Must</w:t>
+            </w:r>
+          </w:p>
+        </w:tc>
+      </w:tr>
+      <w:tr>
+        <w:tc>
+          <w:tcPr/>
+          <w:p>
+            <w:pPr>
+              <w:pStyle w:val="Compact"/>
+              <w:bidi/>
+            </w:pPr>
+            <w:r>
+              <w:rPr>
+                <w:rtl/>
+              </w:rPr>
+              <w:t xml:space="preserve">US-18</w:t>
+            </w:r>
+          </w:p>
+        </w:tc>
+        <w:tc>
+          <w:tcPr/>
+          <w:p>
+            <w:pPr>
+              <w:pStyle w:val="Compact"/>
+              <w:bidi/>
+            </w:pPr>
+            <w:r>
+              <w:rPr>
+                <w:rtl/>
+              </w:rPr>
+              <w:t xml:space="preserve">כל הקמפוס יכול להזמין</w:t>
+            </w:r>
+          </w:p>
+        </w:tc>
+        <w:tc>
+          <w:tcPr/>
+          <w:p>
+            <w:pPr>
+              <w:pStyle w:val="Compact"/>
+              <w:bidi/>
+            </w:pPr>
+            <w:r>
+              <w:rPr>
+                <w:rStyle w:val="VerbatimChar"/>
+                <w:rtl/>
+              </w:rPr>
+              <w:t xml:space="preserve">NFR-4</w:t>
+            </w:r>
+          </w:p>
+        </w:tc>
+        <w:tc>
+          <w:tcPr/>
+          <w:p>
+            <w:pPr>
+              <w:pStyle w:val="Compact"/>
+              <w:bidi/>
+              <w:jc w:val="center"/>
+            </w:pPr>
+            <w:r>
+              <w:rPr>
+                <w:rtl/>
+              </w:rPr>
+              <w:t xml:space="preserve">Must</w:t>
+            </w:r>
+          </w:p>
+        </w:tc>
+      </w:tr>
     </w:tbl>
-    <w:bookmarkStart w:id="33" w:name="דרישות-שאין-להן-סיפור--ולמה"/>
+    <w:bookmarkStart w:id="36" w:name="דרישות-שאין-להן-סיפור-ולמה"/>
     <w:p>
       <w:pPr>
         <w:pStyle w:val="Heading3"/>
@@ -6172,7 +6954,7 @@
         <w:rPr>
           <w:rtl/>
         </w:rPr>
-        <w:t xml:space="preserve">דרישות שאין להן סיפור — ולמה</w:t>
+        <w:t xml:space="preserve">דרישות שאין להן סיפור, ולמה</w:t>
       </w:r>
     </w:p>
     <w:tbl>
@@ -6391,127 +7173,9 @@
           </w:p>
         </w:tc>
       </w:tr>
-      <w:tr>
-        <w:tc>
-          <w:tcPr/>
-          <w:p>
-            <w:pPr>
-              <w:pStyle w:val="Compact"/>
-              <w:bidi/>
-            </w:pPr>
-            <w:r>
-              <w:rPr>
-                <w:rStyle w:val="VerbatimChar"/>
-                <w:rtl/>
-              </w:rPr>
-              <w:t xml:space="preserve">FR-12</w:t>
-            </w:r>
-            <w:r>
-              <w:rPr>
-                <w:rtl/>
-              </w:rPr>
-              <w:t xml:space="preserve"> </w:t>
-            </w:r>
-            <w:r>
-              <w:rPr>
-                <w:rtl/>
-              </w:rPr>
-              <w:t xml:space="preserve">— טיפול בהזמנה שלא נאספה</w:t>
-            </w:r>
-          </w:p>
-        </w:tc>
-        <w:tc>
-          <w:tcPr/>
-          <w:p>
-            <w:pPr>
-              <w:pStyle w:val="Compact"/>
-              <w:bidi/>
-            </w:pPr>
-            <w:r>
-              <w:rPr>
-                <w:b/>
-                <w:bCs/>
-                <w:rtl/>
-              </w:rPr>
-              <w:t xml:space="preserve">מוזנקת-זמן</w:t>
-            </w:r>
-            <w:r>
-              <w:rPr>
-                <w:rtl/>
-              </w:rPr>
-              <w:t xml:space="preserve">: הטריגר הוא שעון, לא אדם. אין ״מי שרוצה״, ולכן אין תבנית סיפור.</w:t>
-            </w:r>
-          </w:p>
-        </w:tc>
-      </w:tr>
-      <w:tr>
-        <w:tc>
-          <w:tcPr/>
-          <w:p>
-            <w:pPr>
-              <w:pStyle w:val="Compact"/>
-              <w:bidi/>
-            </w:pPr>
-            <w:r>
-              <w:rPr>
-                <w:rStyle w:val="VerbatimChar"/>
-                <w:rtl/>
-              </w:rPr>
-              <w:t xml:space="preserve">NFR-4</w:t>
-            </w:r>
-            <w:r>
-              <w:rPr>
-                <w:rtl/>
-              </w:rPr>
-              <w:t xml:space="preserve"> </w:t>
-            </w:r>
-            <w:r>
-              <w:rPr>
-                <w:rtl/>
-              </w:rPr>
-              <w:t xml:space="preserve">— תמיכה ב-5000 סטודנטים</w:t>
-            </w:r>
-          </w:p>
-        </w:tc>
-        <w:tc>
-          <w:tcPr/>
-          <w:p>
-            <w:pPr>
-              <w:pStyle w:val="Compact"/>
-              <w:bidi/>
-            </w:pPr>
-            <w:r>
-              <w:rPr>
-                <w:rtl/>
-              </w:rPr>
-              <w:t xml:space="preserve">אף משתמש לא ״רוצה״ שהמערכת תתמוך ב-5000 משתמשים. כשאין מאחורי הדרישה רצון של מישהו —</w:t>
-            </w:r>
-            <w:r>
-              <w:rPr>
-                <w:rtl/>
-              </w:rPr>
-              <w:t xml:space="preserve"> </w:t>
-            </w:r>
-            <w:r>
-              <w:rPr>
-                <w:b/>
-                <w:bCs/>
-                <w:rtl/>
-              </w:rPr>
-              <w:t xml:space="preserve">מנסחים אותה במלל, לא בכוח כסיפור</w:t>
-            </w:r>
-            <w:r>
-              <w:rPr>
-                <w:rtl/>
-              </w:rPr>
-              <w:t xml:space="preserve">.</w:t>
-            </w:r>
-          </w:p>
-        </w:tc>
-      </w:tr>
     </w:tbl>
-    <w:bookmarkEnd w:id="33"/>
-    <w:bookmarkStart w:id="34" w:name="חמש-הערות-שהטבלה-הזו-מלמדת"/>
+    <w:bookmarkEnd w:id="36"/>
+    <w:bookmarkStart w:id="37" w:name="ארבע-הערות-שהטבלה-הזו-מלמדת"/>
     <w:p>
       <w:pPr>
         <w:pStyle w:val="Heading3"/>
@@ -6521,7 +7185,7 @@
         <w:rPr>
           <w:rtl/>
         </w:rPr>
-        <w:t xml:space="preserve">חמש הערות שהטבלה הזו מלמדת</w:t>
+        <w:t xml:space="preserve">ארבע הערות שהטבלה הזו מלמדת</w:t>
       </w:r>
     </w:p>
     <w:p>
@@ -6529,7 +7193,7 @@
         <w:pStyle w:val="Compact"/>
         <w:numPr>
           <w:ilvl w:val="0"/>
-          <w:numId w:val="1018"/>
+          <w:numId w:val="1020"/>
         </w:numPr>
         <w:bidi/>
       </w:pPr>
@@ -6757,7 +7421,7 @@
         <w:pStyle w:val="Compact"/>
         <w:numPr>
           <w:ilvl w:val="0"/>
-          <w:numId w:val="1018"/>
+          <w:numId w:val="1020"/>
         </w:numPr>
         <w:bidi/>
       </w:pPr>
@@ -6811,7 +7475,7 @@
         <w:pStyle w:val="Compact"/>
         <w:numPr>
           <w:ilvl w:val="0"/>
-          <w:numId w:val="1018"/>
+          <w:numId w:val="1020"/>
         </w:numPr>
         <w:bidi/>
       </w:pPr>
@@ -6896,61 +7560,7 @@
         <w:pStyle w:val="Compact"/>
         <w:numPr>
           <w:ilvl w:val="0"/>
-          <w:numId w:val="1018"/>
-        </w:numPr>
-        <w:bidi/>
-      </w:pPr>
-      <w:r>
-        <w:rPr>
-          <w:b/>
-          <w:bCs/>
-          <w:rtl/>
-        </w:rPr>
-        <w:t xml:space="preserve">CRUD הוא אפוס, לא סיפור.</w:t>
-      </w:r>
-      <w:r>
-        <w:rPr>
-          <w:rtl/>
-        </w:rPr>
-        <w:t xml:space="preserve"> </w:t>
-      </w:r>
-      <w:r>
-        <w:rPr>
-          <w:rtl/>
-        </w:rPr>
-        <w:t xml:space="preserve">״לנהל את X״ נשמע כמו סיפור אחד ואינו כזה: אי-אפשר</w:t>
-      </w:r>
-      <w:r>
-        <w:rPr>
-          <w:rtl/>
-        </w:rPr>
-        <w:t xml:space="preserve"> </w:t>
-      </w:r>
-      <w:r>
-        <w:rPr>
-          <w:rtl/>
-        </w:rPr>
-        <w:t xml:space="preserve">לאמוד אותו, אי-אפשר לבדוק אותו, ואי-אפשר לשחרר ״חצי ניהול״. ארבע פעולות — ארבעה</w:t>
-      </w:r>
-      <w:r>
-        <w:rPr>
-          <w:rtl/>
-        </w:rPr>
-        <w:t xml:space="preserve"> </w:t>
-      </w:r>
-      <w:r>
-        <w:rPr>
-          <w:rtl/>
-        </w:rPr>
-        <w:t xml:space="preserve">סיפורים, כל אחד עם תנאי הקבלה שלו.</w:t>
-      </w:r>
-    </w:p>
-    <w:p>
-      <w:pPr>
-        <w:pStyle w:val="Compact"/>
-        <w:numPr>
-          <w:ilvl w:val="0"/>
-          <w:numId w:val="1018"/>
+          <w:numId w:val="1020"/>
         </w:numPr>
         <w:bidi/>
       </w:pPr>
@@ -7109,12 +7719,24 @@
         <w:rPr>
           <w:rtl/>
         </w:rPr>
-        <w:t xml:space="preserve">אחד-לאחד: הוא ישמח לייצר סיפור לכל דרישה, כולל לדרישות שאין מאחוריהן משתמש שרוצה משהו.</w:t>
-      </w:r>
-    </w:p>
-    <w:bookmarkEnd w:id="34"/>
-    <w:bookmarkEnd w:id="35"/>
-    <w:bookmarkEnd w:id="36"/>
+        <w:t xml:space="preserve">אחד-לאחד: סיפור אחד לכל דרישה, גם כשדרישה אחת צריכה שני סיפורים מזוויות שונות (US-6</w:t>
+      </w:r>
+      <w:r>
+        <w:rPr>
+          <w:rtl/>
+        </w:rPr>
+        <w:t xml:space="preserve"> </w:t>
+      </w:r>
+      <w:r>
+        <w:rPr>
+          <w:rtl/>
+        </w:rPr>
+        <w:t xml:space="preserve">ו-US-8) או כשסיפור אחד מכסה שתיים (US-1).</w:t>
+      </w:r>
+    </w:p>
+    <w:bookmarkEnd w:id="37"/>
+    <w:bookmarkEnd w:id="38"/>
+    <w:bookmarkEnd w:id="39"/>
     <w:sectPr>
       <w:footnotePr>
         <w:numRestart w:val="eachSect"/>
@@ -7383,6 +8005,12 @@
     <w:abstractNumId w:val="991"/>
   </w:num>
   <w:num w:numId="1018">
+    <w:abstractNumId w:val="991"/>
+  </w:num>
+  <w:num w:numId="1019">
+    <w:abstractNumId w:val="991"/>
+  </w:num>
+  <w:num w:numId="1020">
     <w:abstractNumId w:val="991"/>
   </w:num>
 </w:numbering>

</xml_diff>